<commit_message>
added main.py file, the first test of FastAPI
</commit_message>
<xml_diff>
--- a/Documentation/4. Setting up GitHub.docx
+++ b/Documentation/4. Setting up GitHub.docx
@@ -289,15 +289,581 @@
       </w:r>
       <w:r>
         <w:br/>
-      </w:r>
-      <w:proofErr w:type="spellStart"/>
-      <w:r>
-        <w:t>TherapistManagementSystem</w:t>
-      </w:r>
-      <w:proofErr w:type="spellEnd"/>
-      <w:r>
-        <w:br/>
-      </w:r>
+        <w:t>TherapistManagementSyste</w:t>
+      </w:r>
+      <w:r>
+        <w:t>m</w:t>
+      </w:r>
+    </w:p>
+    <w:p/>
+    <w:p>
+      <w:pPr>
+        <w:pStyle w:val="ListParagraph"/>
+        <w:numPr>
+          <w:ilvl w:val="0"/>
+          <w:numId w:val="2"/>
+        </w:numPr>
+        <w:rPr>
+          <w:b/>
+          <w:bCs/>
+          <w:u w:val="single"/>
+        </w:rPr>
+      </w:pPr>
+      <w:r>
+        <w:rPr>
+          <w:b/>
+          <w:bCs/>
+          <w:u w:val="single"/>
+        </w:rPr>
+        <w:t>Configure git for the project</w:t>
+      </w:r>
+    </w:p>
+    <w:p>
+      <w:pPr>
+        <w:pStyle w:val="ListParagraph"/>
+        <w:rPr>
+          <w:b/>
+          <w:bCs/>
+          <w:u w:val="single"/>
+        </w:rPr>
+      </w:pPr>
+    </w:p>
+    <w:p>
+      <w:pPr>
+        <w:pStyle w:val="ListParagraph"/>
+      </w:pPr>
+      <w:r>
+        <w:t>Open your command prompt (as admin) and go to the project:</w:t>
+      </w:r>
+      <w:r>
+        <w:br/>
+      </w:r>
+      <w:r>
+        <w:br/>
+        <w:t xml:space="preserve">cd </w:t>
+      </w:r>
+      <w:r>
+        <w:t>C:\Projects\Psychologist Client Management System</w:t>
+      </w:r>
+    </w:p>
+    <w:p>
+      <w:pPr>
+        <w:pStyle w:val="ListParagraph"/>
+      </w:pPr>
+    </w:p>
+    <w:p>
+      <w:pPr>
+        <w:pStyle w:val="ListParagraph"/>
+      </w:pPr>
+      <w:r>
+        <w:t>Then run your username and email to tell git who you are:</w:t>
+      </w:r>
+      <w:r>
+        <w:br/>
+      </w:r>
+      <w:r>
+        <w:br/>
+      </w:r>
+      <w:r>
+        <w:t>git config --global user.name "YourName"</w:t>
+      </w:r>
+    </w:p>
+    <w:p>
+      <w:pPr>
+        <w:pStyle w:val="ListParagraph"/>
+      </w:pPr>
+      <w:r>
+        <w:t xml:space="preserve">git config --global user.email </w:t>
+      </w:r>
+      <w:r>
+        <w:t>“</w:t>
+      </w:r>
+      <w:hyperlink r:id="rId7" w:history="1">
+        <w:r>
+          <w:rPr>
+            <w:rStyle w:val="Hyperlink"/>
+          </w:rPr>
+          <w:t>your-email@example.com</w:t>
+        </w:r>
+      </w:hyperlink>
+      <w:r>
+        <w:t>”</w:t>
+      </w:r>
+    </w:p>
+    <w:p>
+      <w:pPr>
+        <w:pStyle w:val="ListParagraph"/>
+        <w:numPr>
+          <w:ilvl w:val="0"/>
+          <w:numId w:val="2"/>
+        </w:numPr>
+        <w:rPr>
+          <w:b/>
+          <w:bCs/>
+          <w:u w:val="single"/>
+        </w:rPr>
+      </w:pPr>
+      <w:r>
+        <w:rPr>
+          <w:b/>
+          <w:bCs/>
+          <w:u w:val="single"/>
+        </w:rPr>
+        <w:lastRenderedPageBreak/>
+        <w:t>Initialize git for you project</w:t>
+      </w:r>
+    </w:p>
+    <w:p>
+      <w:pPr>
+        <w:pStyle w:val="ListParagraph"/>
+        <w:rPr>
+          <w:b/>
+          <w:bCs/>
+          <w:u w:val="single"/>
+        </w:rPr>
+      </w:pPr>
+    </w:p>
+    <w:p>
+      <w:pPr>
+        <w:pStyle w:val="ListParagraph"/>
+      </w:pPr>
+      <w:r>
+        <w:t>After declaring your user name and email then run:</w:t>
+      </w:r>
+    </w:p>
+    <w:p>
+      <w:pPr>
+        <w:pStyle w:val="ListParagraph"/>
+      </w:pPr>
+    </w:p>
+    <w:p>
+      <w:pPr>
+        <w:pStyle w:val="ListParagraph"/>
+      </w:pPr>
+      <w:r>
+        <w:t>git init</w:t>
+      </w:r>
+      <w:r>
+        <w:t xml:space="preserve"> </w:t>
+      </w:r>
+    </w:p>
+    <w:p>
+      <w:pPr>
+        <w:pStyle w:val="ListParagraph"/>
+      </w:pPr>
+    </w:p>
+    <w:p>
+      <w:pPr>
+        <w:pStyle w:val="ListParagraph"/>
+      </w:pPr>
+      <w:r>
+        <w:t xml:space="preserve">Then add all your work into </w:t>
+      </w:r>
+      <w:r>
+        <w:t>a “staging” phase where it’s between your machine and Github but still is not fully uploaded since you haven’t specified the exact repository:</w:t>
+      </w:r>
+      <w:r>
+        <w:br/>
+      </w:r>
+      <w:r>
+        <w:br/>
+        <w:t>git add .</w:t>
+      </w:r>
+    </w:p>
+    <w:p>
+      <w:pPr>
+        <w:pStyle w:val="ListParagraph"/>
+      </w:pPr>
+    </w:p>
+    <w:p>
+      <w:pPr>
+        <w:pStyle w:val="ListParagraph"/>
+      </w:pPr>
+      <w:r>
+        <w:t>Then finally add a comment:</w:t>
+      </w:r>
+      <w:r>
+        <w:br/>
+      </w:r>
+      <w:r>
+        <w:br/>
+      </w:r>
+      <w:r>
+        <w:t>git commit -m "Initial commit"</w:t>
+      </w:r>
+    </w:p>
+    <w:p/>
+    <w:p>
+      <w:pPr>
+        <w:pStyle w:val="ListParagraph"/>
+        <w:numPr>
+          <w:ilvl w:val="0"/>
+          <w:numId w:val="2"/>
+        </w:numPr>
+        <w:rPr>
+          <w:b/>
+          <w:bCs/>
+          <w:u w:val="single"/>
+        </w:rPr>
+      </w:pPr>
+      <w:r>
+        <w:rPr>
+          <w:b/>
+          <w:bCs/>
+          <w:u w:val="single"/>
+        </w:rPr>
+        <w:t xml:space="preserve">Connect to </w:t>
+      </w:r>
+      <w:r>
+        <w:rPr>
+          <w:b/>
+          <w:bCs/>
+          <w:u w:val="single"/>
+        </w:rPr>
+        <w:t>GitHub repository:</w:t>
+      </w:r>
+      <w:r>
+        <w:rPr>
+          <w:b/>
+          <w:bCs/>
+          <w:u w:val="single"/>
+        </w:rPr>
+        <w:br/>
+      </w:r>
+    </w:p>
+    <w:p>
+      <w:pPr>
+        <w:pStyle w:val="ListParagraph"/>
+      </w:pPr>
+      <w:r>
+        <w:t>Run the following code in the cmd:</w:t>
+      </w:r>
+    </w:p>
+    <w:p>
+      <w:pPr>
+        <w:pStyle w:val="ListParagraph"/>
+      </w:pPr>
+    </w:p>
+    <w:p>
+      <w:pPr>
+        <w:pStyle w:val="ListParagraph"/>
+      </w:pPr>
+      <w:r>
+        <w:t xml:space="preserve">git remote add origin </w:t>
+      </w:r>
+      <w:hyperlink r:id="rId8" w:history="1">
+        <w:r>
+          <w:rPr>
+            <w:rStyle w:val="Hyperlink"/>
+          </w:rPr>
+          <w:t>https://github.com/your-username/</w:t>
+        </w:r>
+        <w:r>
+          <w:rPr>
+            <w:rStyle w:val="Hyperlink"/>
+          </w:rPr>
+          <w:t>your_repository_name</w:t>
+        </w:r>
+        <w:r>
+          <w:rPr>
+            <w:rStyle w:val="Hyperlink"/>
+          </w:rPr>
+          <w:t>.git</w:t>
+        </w:r>
+      </w:hyperlink>
+    </w:p>
+    <w:p/>
+    <w:p>
+      <w:pPr>
+        <w:pStyle w:val="ListParagraph"/>
+        <w:numPr>
+          <w:ilvl w:val="0"/>
+          <w:numId w:val="2"/>
+        </w:numPr>
+        <w:rPr>
+          <w:b/>
+          <w:bCs/>
+          <w:u w:val="single"/>
+        </w:rPr>
+      </w:pPr>
+      <w:r>
+        <w:rPr>
+          <w:b/>
+          <w:bCs/>
+          <w:u w:val="single"/>
+        </w:rPr>
+        <w:t>Push the information into GitHub:</w:t>
+      </w:r>
+    </w:p>
+    <w:p>
+      <w:pPr>
+        <w:pStyle w:val="ListParagraph"/>
+        <w:rPr>
+          <w:b/>
+          <w:bCs/>
+          <w:u w:val="single"/>
+        </w:rPr>
+      </w:pPr>
+    </w:p>
+    <w:p>
+      <w:pPr>
+        <w:pStyle w:val="ListParagraph"/>
+      </w:pPr>
+      <w:r>
+        <w:t>Now you can push all the work into your GitHub account and repository. Note that you can create different branches for your work but usually the main branch is the one that is the final branch.</w:t>
+      </w:r>
+    </w:p>
+    <w:p>
+      <w:pPr>
+        <w:pStyle w:val="ListParagraph"/>
+      </w:pPr>
+    </w:p>
+    <w:p>
+      <w:pPr>
+        <w:pStyle w:val="ListParagraph"/>
+      </w:pPr>
+      <w:r>
+        <w:t>So create a new branch for development:</w:t>
+      </w:r>
+    </w:p>
+    <w:p>
+      <w:pPr>
+        <w:pStyle w:val="ListParagraph"/>
+      </w:pPr>
+    </w:p>
+    <w:p>
+      <w:pPr>
+        <w:pStyle w:val="ListParagraph"/>
+      </w:pPr>
+      <w:r>
+        <w:t>git checkout -b dev</w:t>
+      </w:r>
+    </w:p>
+    <w:p>
+      <w:pPr>
+        <w:pStyle w:val="ListParagraph"/>
+      </w:pPr>
+    </w:p>
+    <w:p>
+      <w:pPr>
+        <w:pStyle w:val="ListParagraph"/>
+      </w:pPr>
+      <w:r>
+        <w:t>Then push to that branch:</w:t>
+      </w:r>
+    </w:p>
+    <w:p>
+      <w:pPr>
+        <w:pStyle w:val="ListParagraph"/>
+      </w:pPr>
+    </w:p>
+    <w:p>
+      <w:pPr>
+        <w:pStyle w:val="ListParagraph"/>
+      </w:pPr>
+      <w:r>
+        <w:t>git push --set-upstream origin dev</w:t>
+      </w:r>
+      <w:r>
+        <w:t xml:space="preserve"> (if it’s the first time)</w:t>
+      </w:r>
+    </w:p>
+    <w:p>
+      <w:pPr>
+        <w:pStyle w:val="ListParagraph"/>
+      </w:pPr>
+    </w:p>
+    <w:p>
+      <w:pPr>
+        <w:pStyle w:val="ListParagraph"/>
+      </w:pPr>
+      <w:r>
+        <w:t>git push origin dev</w:t>
+      </w:r>
+      <w:r>
+        <w:t xml:space="preserve"> (any other time)</w:t>
+      </w:r>
+    </w:p>
+    <w:p/>
+    <w:p>
+      <w:pPr>
+        <w:pStyle w:val="ListParagraph"/>
+        <w:numPr>
+          <w:ilvl w:val="0"/>
+          <w:numId w:val="2"/>
+        </w:numPr>
+        <w:rPr>
+          <w:b/>
+          <w:bCs/>
+          <w:u w:val="single"/>
+        </w:rPr>
+      </w:pPr>
+      <w:r>
+        <w:rPr>
+          <w:b/>
+          <w:bCs/>
+          <w:u w:val="single"/>
+        </w:rPr>
+        <w:t>Pull the information into GitHub</w:t>
+      </w:r>
+      <w:r>
+        <w:rPr>
+          <w:b/>
+          <w:bCs/>
+          <w:u w:val="single"/>
+        </w:rPr>
+        <w:br/>
+      </w:r>
+    </w:p>
+    <w:p>
+      <w:pPr>
+        <w:pStyle w:val="ListParagraph"/>
+      </w:pPr>
+      <w:r>
+        <w:t>After the step above you can visit GitHub.com and you’ll see there’ll be a button to pull what you pushed into GitHub</w:t>
+      </w:r>
+      <w:r>
+        <w:t>.</w:t>
+      </w:r>
+    </w:p>
+    <w:p/>
+    <w:p>
+      <w:pPr>
+        <w:pStyle w:val="ListParagraph"/>
+        <w:numPr>
+          <w:ilvl w:val="0"/>
+          <w:numId w:val="2"/>
+        </w:numPr>
+      </w:pPr>
+      <w:r>
+        <w:rPr>
+          <w:b/>
+          <w:bCs/>
+          <w:u w:val="single"/>
+        </w:rPr>
+        <w:lastRenderedPageBreak/>
+        <w:t>Future process</w:t>
+      </w:r>
+      <w:r>
+        <w:rPr>
+          <w:b/>
+          <w:bCs/>
+          <w:u w:val="single"/>
+        </w:rPr>
+        <w:br/>
+      </w:r>
+      <w:r>
+        <w:br/>
+        <w:t xml:space="preserve">After editing </w:t>
+      </w:r>
+      <w:r>
+        <w:t>the project you can add to git and then push and pull just like the process above</w:t>
+      </w:r>
+      <w:r>
+        <w:t>:</w:t>
+      </w:r>
+      <w:r>
+        <w:br/>
+      </w:r>
+      <w:r>
+        <w:br/>
+        <w:t>specific file:</w:t>
+      </w:r>
+      <w:r>
+        <w:br/>
+      </w:r>
+      <w:r>
+        <w:t>git add filename.py</w:t>
+      </w:r>
+    </w:p>
+    <w:p>
+      <w:pPr>
+        <w:pStyle w:val="ListParagraph"/>
+        <w:rPr>
+          <w:b/>
+          <w:bCs/>
+          <w:u w:val="single"/>
+        </w:rPr>
+      </w:pPr>
+    </w:p>
+    <w:p>
+      <w:pPr>
+        <w:pStyle w:val="ListParagraph"/>
+      </w:pPr>
+      <w:r>
+        <w:t>multiple files:</w:t>
+      </w:r>
+      <w:r>
+        <w:br/>
+      </w:r>
+      <w:r>
+        <w:t>git add file1.py file2.py</w:t>
+      </w:r>
+      <w:r>
+        <w:br/>
+      </w:r>
+    </w:p>
+    <w:p>
+      <w:pPr>
+        <w:pStyle w:val="ListParagraph"/>
+      </w:pPr>
+      <w:r>
+        <w:t>to add part of a file:</w:t>
+      </w:r>
+      <w:r>
+        <w:br/>
+      </w:r>
+      <w:r>
+        <w:t>git add -p filename.py</w:t>
+      </w:r>
+    </w:p>
+    <w:p>
+      <w:pPr>
+        <w:pStyle w:val="ListParagraph"/>
+      </w:pPr>
+    </w:p>
+    <w:p>
+      <w:pPr>
+        <w:pStyle w:val="ListParagraph"/>
+      </w:pPr>
+      <w:r>
+        <w:t>commit changes:</w:t>
+      </w:r>
+      <w:r>
+        <w:br/>
+      </w:r>
+      <w:r>
+        <w:t>git commit -m "Updated feature X and fixed bug Y"</w:t>
+      </w:r>
+    </w:p>
+    <w:p>
+      <w:pPr>
+        <w:pStyle w:val="ListParagraph"/>
+      </w:pPr>
+    </w:p>
+    <w:p>
+      <w:pPr>
+        <w:pStyle w:val="ListParagraph"/>
+      </w:pPr>
+      <w:r>
+        <w:t>push to github:</w:t>
+      </w:r>
+      <w:r>
+        <w:br/>
+      </w:r>
+      <w:r>
+        <w:t>git push origin branch-name</w:t>
+      </w:r>
+    </w:p>
+    <w:p>
+      <w:pPr>
+        <w:jc w:val="center"/>
+      </w:pPr>
+    </w:p>
+    <w:p>
+      <w:pPr>
+        <w:jc w:val="center"/>
+      </w:pPr>
     </w:p>
     <w:sectPr>
       <w:pgSz w:w="11906" w:h="16838"/>
@@ -427,8 +993,8 @@
   <w:abstractNum w:abstractNumId="1" w15:restartNumberingAfterBreak="0">
     <w:nsid w:val="788B32F8"/>
     <w:multiLevelType w:val="hybridMultilevel"/>
-    <w:tmpl w:val="0780F3E2"/>
-    <w:lvl w:ilvl="0" w:tplc="1C09000F">
+    <w:tmpl w:val="0018EB98"/>
+    <w:lvl w:ilvl="0" w:tplc="BC26898C">
       <w:start w:val="1"/>
       <w:numFmt w:val="decimal"/>
       <w:lvlText w:val="%1."/>
@@ -438,6 +1004,8 @@
       </w:pPr>
       <w:rPr>
         <w:rFonts w:hint="default"/>
+        <w:b/>
+        <w:bCs/>
       </w:rPr>
     </w:lvl>
     <w:lvl w:ilvl="1" w:tplc="1C090019" w:tentative="1">
@@ -1125,7 +1693,6 @@
   <w:style w:type="character" w:default="1" w:styleId="DefaultParagraphFont">
     <w:name w:val="Default Paragraph Font"/>
     <w:uiPriority w:val="1"/>
-    <w:semiHidden/>
     <w:unhideWhenUsed/>
   </w:style>
   <w:style w:type="table" w:default="1" w:styleId="TableNormal">

</xml_diff>